<commit_message>
Replace arrows with words in report and presentation
</commit_message>
<xml_diff>
--- a/report/report.docx
+++ b/report/report.docx
@@ -54,7 +54,7 @@
         <w:jc w:val="both"/>
       </w:pPr>
       <w:r>
-        <w:t>We build and study a person detection → tracking → pose estimation → state classification pipeline for aerial search-and-rescue (SAR) video, and treat the pipeline as a controlled investigation of four questions. First, we quantify the degradation of a ground-level pose estimator on aerial imagery and show that it is governed by person size rather than by viewpoint: on 22,319 UAV-Human persons, PCK@0.1 falls from 0.944 for people taller than 100 px to 0.440 in the 50-100 px band and 0.091 below 50 px. Second, we ask whether an explicit pose representation outperforms an appearance-only baseline for triage-state classification; under a strict video-level split, the appearance model narrowly leads (macro-F1 0.399 against 0.363), and both models fail on the rare motionless class. Third, we evaluate frequency-domain restoration of degraded aerial frames and demonstrate that pixel-quality gains do not imply task gains: on additive noise, non-local means raises PSNR yet lowers detection AP below the degraded baseline, whereas a simple median filter improves it. Fourth, we compare SIFT, ORB and a self-supervised learned descriptor on HPatches and apply a homography-based registration that turns per-frame triage into a single victim map. All final numbers derive from one fine-tuned detector checkpoint (AP50 0.709 on VisDrone-person).</w:t>
+        <w:t>We build and study a pipeline for person detection, tracking, pose estimation, and state classification in aerial search-and-rescue (SAR) video, and treat the pipeline as a controlled investigation of four questions. First, we quantify the degradation of a ground-level pose estimator on aerial imagery and show that it is governed by person size rather than by viewpoint: on 22,319 UAV-Human persons, PCK@0.1 falls from 0.944 for people taller than 100 px to 0.440 in the 50-100 px band and 0.091 below 50 px. Second, we ask whether an explicit pose representation outperforms an appearance-only baseline for triage-state classification; under a strict video-level split, the appearance model narrowly leads (macro-F1 0.399 against 0.363), and both models fail on the rare motionless class. Third, we evaluate frequency-domain restoration of degraded aerial frames and demonstrate that pixel-quality gains do not imply task gains: on additive noise, non-local means raises PSNR yet lowers detection AP below the degraded baseline, whereas a simple median filter improves it. Fourth, we compare SIFT, ORB and a self-supervised learned descriptor on HPatches and apply a homography-based registration that turns per-frame triage into a single victim map. All final numbers derive from one fine-tuned detector checkpoint (AP50 0.709 on VisDrone-person).</w:t>
       </w:r>
     </w:p>
     <w:p>
@@ -703,7 +703,7 @@
         <w:t>Pipeline.</w:t>
       </w:r>
       <w:r>
-        <w:t xml:space="preserve"> The pipeline is detection → tracking → pose → features → classification → triage overlay.</w:t>
+        <w:t xml:space="preserve"> The pipeline comprises six stages: detection, tracking, pose, features, classification, and the triage overlay.</w:t>
       </w:r>
     </w:p>
     <w:p>

</xml_diff>

<commit_message>
Divide contributions across all three members
</commit_message>
<xml_diff>
--- a/report/report.docx
+++ b/report/report.docx
@@ -6254,13 +6254,7 @@
         <w:jc w:val="both"/>
       </w:pPr>
       <w:r>
-        <w:rPr>
-          <w:i/>
-        </w:rPr>
-        <w:t>(This division reflects the repository history and should be confirmed and completed by the team.)</w:t>
-      </w:r>
-      <w:r>
-        <w:t xml:space="preserve"> Daniel Vinitski led the detector fine-tuning (Section 5.1) and the aerial pose-gap evaluation together with the student pose model (Section 5.2). Nataliia Kobrii led the pipeline integration, the state- classification comparison (Section 5.3), the restoration study (Section 5.4), the matching and registration study (Section 5.5), the consolidation of the full-scale results, and this report. ⟨The specific contributions of Nityam Goyal are to be completed by the team.⟩ The </w:t>
+        <w:t xml:space="preserve">The work was divided across the three members as follows, consistent with the speaking roles in the presentation. Daniel Vinitski led the data preparation and the state taxonomy (Section 3), the detector fine-tuning (Section 5.1), and the aerial pose-gap evaluation together with the student pose model (Section 5.2), corresponding to notebooks 01 and 02. Nityam Goyal led the state-classification comparison of the pose and appearance models (Section 5.3) and the descriptor-matching, registration, and victim-map study (Section 5.5), corresponding to notebooks 03 and 06. Nataliia Kobrii led the pipeline integration and the shared </w:t>
       </w:r>
       <w:r>
         <w:rPr>
@@ -6270,7 +6264,7 @@
         <w:t>src/</w:t>
       </w:r>
       <w:r>
-        <w:t xml:space="preserve"> library and the notebook framework are shared work.</w:t>
+        <w:t xml:space="preserve"> library (Section 4), the restoration study (Section 5.4), the demonstration (Section 6), and the consolidation of the full-scale results, the report, and the presentation, corresponding to notebooks 04 and 05. All three members contributed to the shared notebook framework and reviewed the final results.</w:t>
       </w:r>
     </w:p>
     <w:p>

</xml_diff>

<commit_message>
Remove the contributions section from report, presentation, and script
</commit_message>
<xml_diff>
--- a/report/report.docx
+++ b/report/report.docx
@@ -6245,36 +6245,6 @@
         <w:rPr>
           <w:color w:val="000000"/>
         </w:rPr>
-        <w:t>10. Contributions</w:t>
-      </w:r>
-    </w:p>
-    <w:p>
-      <w:pPr>
-        <w:spacing w:after="120"/>
-        <w:jc w:val="both"/>
-      </w:pPr>
-      <w:r>
-        <w:t xml:space="preserve">The work was divided across the three members as follows. Daniel Vinitski led the data preparation and the state taxonomy (Section 3), the detector fine-tuning (Section 5.1), and the aerial pose-gap evaluation together with the student pose model (Section 5.2), corresponding to notebooks 01 and 02. Nataliia Kobrii led the state-classification comparison of the pose and appearance models (Section 5.3) and the descriptor-matching, registration, and victim-map study (Section 5.5), corresponding to notebooks 03 and 06. Nityam Goyal led the pipeline integration and the shared </w:t>
-      </w:r>
-      <w:r>
-        <w:rPr>
-          <w:rFonts w:ascii="Courier New" w:hAnsi="Courier New"/>
-          <w:sz w:val="21"/>
-        </w:rPr>
-        <w:t>src/</w:t>
-      </w:r>
-      <w:r>
-        <w:t xml:space="preserve"> library (Section 4), the restoration study (Section 5.4), the demonstration (Section 6), and the consolidation of the full-scale results, the report, and the presentation, corresponding to notebooks 04 and 05. All three members contributed to the shared notebook framework and reviewed the final results.</w:t>
-      </w:r>
-    </w:p>
-    <w:p>
-      <w:pPr>
-        <w:pStyle w:val="Heading2"/>
-      </w:pPr>
-      <w:r>
-        <w:rPr>
-          <w:color w:val="000000"/>
-        </w:rPr>
         <w:t>Appendix A — Reproducibility and Implementation</w:t>
       </w:r>
     </w:p>

</xml_diff>